<commit_message>
CH-stretching figure: label only the main band (2933/2937 cm-1)
Co-Authored-By: Claude Opus 5.5 <noreply@anthropic.com>
Claude-Session: https://claude.ai/code/session_01L8hQ8e5u5KmaH4dD9snyRw
</commit_message>
<xml_diff>
--- a/Acacia_PCA_LDA_Figure_Code.docx
+++ b/Acacia_PCA_LDA_Figure_Code.docx
@@ -2810,6 +2810,32 @@
           <w:sz w:val="15"/>
           <w:noProof/>
         </w:rPr>
+        <w:t># bands labelled (and shadowed) in the figure; all bands are written to the CSV</w:t>
+      </w:r>
+    </w:p>
+    <w:p>
+      <w:pPr>
+        <w:spacing w:before="0" w:after="0" w:line="240" w:lineRule="auto"/>
+      </w:pPr>
+      <w:r>
+        <w:rPr>
+          <w:rFonts w:ascii="Consolas" w:hAnsi="Consolas" w:eastAsia="Consolas" w:cs="Consolas"/>
+          <w:sz w:val="15"/>
+          <w:noProof/>
+        </w:rPr>
+        <w:t>CH_SHOW = [2935]                           # main CH band only</w:t>
+      </w:r>
+    </w:p>
+    <w:p>
+      <w:pPr>
+        <w:spacing w:before="0" w:after="0" w:line="240" w:lineRule="auto"/>
+      </w:pPr>
+      <w:r>
+        <w:rPr>
+          <w:rFonts w:ascii="Consolas" w:hAnsi="Consolas" w:eastAsia="Consolas" w:cs="Consolas"/>
+          <w:sz w:val="15"/>
+          <w:noProof/>
+        </w:rPr>
         <w:t># (nominal band, search half-width, 'max' or 'sh', class, assignment)</w:t>
       </w:r>
     </w:p>
@@ -3441,7 +3467,7 @@
           <w:sz w:val="15"/>
           <w:noProof/>
         </w:rPr>
-        <w:t xml:space="preserve">    if consistent:</w:t>
+        <w:t xml:space="preserve">    if consistent and nominal in CH_SHOW:</w:t>
       </w:r>
     </w:p>
     <w:p>
@@ -3610,7 +3636,7 @@
           <w:sz w:val="15"/>
           <w:noProof/>
         </w:rPr>
-        <w:t xml:space="preserve">        if r[0] != GROUPS[c] or r[3] == 'not resolved':     # unresolved bands: no label</w:t>
+        <w:t xml:space="preserve">        if r[0] != GROUPS[c] or r[3] == 'not resolved' or r[1] not in CH_SHOW:</w:t>
       </w:r>
     </w:p>
     <w:p>
@@ -3753,7 +3779,7 @@
           <w:sz w:val="15"/>
           <w:noProof/>
         </w:rPr>
-        <w:t xml:space="preserve">            (X[y == 1].mean(0) + X[y == 1].std(0, ddof=1)).max() + CH_OFFSET + 6.2)</w:t>
+        <w:t xml:space="preserve">            (X[y == 1].mean(0) + X[y == 1].std(0, ddof=1)).max() + CH_OFFSET + 4.4)</w:t>
       </w:r>
     </w:p>
     <w:p>

</xml_diff>